<commit_message>
Guides : la discussion interne
Section commune « Comptes internes : la discussion » (README des guides), reprise dans chaque guide
Word sauf celui du porteur de projet (build.js l'en écarte) ; guide de l'administration : retirer
un compte désactivé des discussions, sans lire les conversations. Guides Word régénérés
(node docs/guides/build.js).

Co-Authored-By: Claude Opus 5.5 <noreply@anthropic.com>
</commit_message>
<xml_diff>
--- a/docs/guides/word/Guide_achats.docx
+++ b/docs/guides/word/Guide_achats.docx
@@ -225,6 +225,214 @@
           <w:szCs w:val="20"/>
         </w:rPr>
         <w:t xml:space="preserve">Téléphone perdu ou changé : demander à l'administrateur de réinitialiser la double authentification. Mot de passe oublié : l'administrateur en remet un nouveau, provisoire. Les sessions expirent d'elles-mêmes au bout de quelques heures ; toutes les connexions sont journalisées.</w:t>
+      </w:r>
+    </w:p>
+    <w:p>
+      <w:pPr>
+        <w:keepNext/>
+        <w:pBdr>
+          <w:bottom w:val="single" w:color="1A9E9E" w:sz="6" w:space="2"/>
+        </w:pBdr>
+        <w:spacing w:after="100" w:before="280"/>
+      </w:pPr>
+      <w:r>
+        <w:rPr>
+          <w:rFonts w:ascii="Calibri" w:cs="Calibri" w:eastAsia="Calibri" w:hAnsi="Calibri"/>
+          <w:b/>
+          <w:bCs/>
+          <w:color w:val="1C1E6B"/>
+          <w:sz w:val="26"/>
+          <w:szCs w:val="26"/>
+        </w:rPr>
+        <w:t xml:space="preserve">Comptes internes : la discussion</w:t>
+      </w:r>
+    </w:p>
+    <w:p>
+      <w:pPr>
+        <w:spacing w:after="100"/>
+        <w:jc w:val="both"/>
+      </w:pPr>
+      <w:r>
+        <w:rPr>
+          <w:rFonts w:ascii="Calibri" w:cs="Calibri" w:eastAsia="Calibri" w:hAnsi="Calibri"/>
+          <w:sz w:val="20"/>
+          <w:szCs w:val="20"/>
+        </w:rPr>
+        <w:t xml:space="preserve">Pour échanger entre collègues sans quitter la plateforme (jamais avec les porteurs de projets, qui écrivent à leur consultant depuis le portail).</w:t>
+      </w:r>
+    </w:p>
+    <w:p>
+      <w:pPr>
+        <w:tabs>
+          <w:tab w:val="left" w:pos="360"/>
+        </w:tabs>
+        <w:spacing w:after="60"/>
+        <w:ind w:left="360" w:hanging="360"/>
+        <w:jc w:val="both"/>
+      </w:pPr>
+      <w:r>
+        <w:rPr>
+          <w:rFonts w:ascii="Calibri" w:cs="Calibri" w:eastAsia="Calibri" w:hAnsi="Calibri"/>
+          <w:b/>
+          <w:bCs/>
+          <w:color w:val="1A9E9E"/>
+          <w:sz w:val="20"/>
+          <w:szCs w:val="20"/>
+        </w:rPr>
+        <w:t xml:space="preserve">•	</w:t>
+      </w:r>
+      <w:r>
+        <w:rPr>
+          <w:rFonts w:ascii="Calibri" w:cs="Calibri" w:eastAsia="Calibri" w:hAnsi="Calibri"/>
+          <w:sz w:val="20"/>
+          <w:szCs w:val="20"/>
+        </w:rPr>
+        <w:t xml:space="preserve">L'icône à bulles, en haut de l'écran, ouvre le panneau de discussion ; le chiffre sur l'icône compte les messages non lus. « Pleine page » ouvre la même discussion en grand.</w:t>
+      </w:r>
+    </w:p>
+    <w:p>
+      <w:pPr>
+        <w:tabs>
+          <w:tab w:val="left" w:pos="360"/>
+        </w:tabs>
+        <w:spacing w:after="60"/>
+        <w:ind w:left="360" w:hanging="360"/>
+        <w:jc w:val="both"/>
+      </w:pPr>
+      <w:r>
+        <w:rPr>
+          <w:rFonts w:ascii="Calibri" w:cs="Calibri" w:eastAsia="Calibri" w:hAnsi="Calibri"/>
+          <w:b/>
+          <w:bCs/>
+          <w:color w:val="1A9E9E"/>
+          <w:sz w:val="20"/>
+          <w:szCs w:val="20"/>
+        </w:rPr>
+        <w:t xml:space="preserve">•	</w:t>
+      </w:r>
+      <w:r>
+        <w:rPr>
+          <w:rFonts w:ascii="Calibri" w:cs="Calibri" w:eastAsia="Calibri" w:hAnsi="Calibri"/>
+          <w:sz w:val="20"/>
+          <w:szCs w:val="20"/>
+        </w:rPr>
+        <w:t xml:space="preserve">« Nouvelle » : « À deux » (choisir un collègue) ou « Groupe » (un nom, des collègues). Seuls les collègues qui partagent au moins une société avec vous sont proposés. Le créateur d'un groupe en est le responsable : lui seul y ajoute ou en retire des membres ; chacun peut le quitter.</w:t>
+      </w:r>
+    </w:p>
+    <w:p>
+      <w:pPr>
+        <w:tabs>
+          <w:tab w:val="left" w:pos="360"/>
+        </w:tabs>
+        <w:spacing w:after="60"/>
+        <w:ind w:left="360" w:hanging="360"/>
+        <w:jc w:val="both"/>
+      </w:pPr>
+      <w:r>
+        <w:rPr>
+          <w:rFonts w:ascii="Calibri" w:cs="Calibri" w:eastAsia="Calibri" w:hAnsi="Calibri"/>
+          <w:b/>
+          <w:bCs/>
+          <w:color w:val="1A9E9E"/>
+          <w:sz w:val="20"/>
+          <w:szCs w:val="20"/>
+        </w:rPr>
+        <w:t xml:space="preserve">•	</w:t>
+      </w:r>
+      <w:r>
+        <w:rPr>
+          <w:rFonts w:ascii="Calibri" w:cs="Calibri" w:eastAsia="Calibri" w:hAnsi="Calibri"/>
+          <w:sz w:val="20"/>
+          <w:szCs w:val="20"/>
+        </w:rPr>
+        <w:t xml:space="preserve">Sur une fiche (dossier AxisPro, chantier, rotation, bien), le bouton « Discussion » ouvre la conversation de la fiche, ouverte à tous ceux qui peuvent lire la fiche.</w:t>
+      </w:r>
+    </w:p>
+    <w:p>
+      <w:pPr>
+        <w:tabs>
+          <w:tab w:val="left" w:pos="360"/>
+        </w:tabs>
+        <w:spacing w:after="60"/>
+        <w:ind w:left="360" w:hanging="360"/>
+        <w:jc w:val="both"/>
+      </w:pPr>
+      <w:r>
+        <w:rPr>
+          <w:rFonts w:ascii="Calibri" w:cs="Calibri" w:eastAsia="Calibri" w:hAnsi="Calibri"/>
+          <w:b/>
+          <w:bCs/>
+          <w:color w:val="1A9E9E"/>
+          <w:sz w:val="20"/>
+          <w:szCs w:val="20"/>
+        </w:rPr>
+        <w:t xml:space="preserve">•	</w:t>
+      </w:r>
+      <w:r>
+        <w:rPr>
+          <w:rFonts w:ascii="Calibri" w:cs="Calibri" w:eastAsia="Calibri" w:hAnsi="Calibri"/>
+          <w:sz w:val="20"/>
+          <w:szCs w:val="20"/>
+        </w:rPr>
+        <w:t xml:space="preserve">Écrire : Entrée envoie, Maj + Entrée passe à la ligne ; le trombone joint jusqu'à cinq fichiers (PDF, JPEG, PNG, Word .docx ou Excel .xlsx, 20 Mo chacun). « Répondre » cite un message ; « Retirer » efface pour tous un message que vous avez envoyé (« Message retiré » reste affiché).</w:t>
+      </w:r>
+    </w:p>
+    <w:p>
+      <w:pPr>
+        <w:tabs>
+          <w:tab w:val="left" w:pos="360"/>
+        </w:tabs>
+        <w:spacing w:after="60"/>
+        <w:ind w:left="360" w:hanging="360"/>
+        <w:jc w:val="both"/>
+      </w:pPr>
+      <w:r>
+        <w:rPr>
+          <w:rFonts w:ascii="Calibri" w:cs="Calibri" w:eastAsia="Calibri" w:hAnsi="Calibri"/>
+          <w:b/>
+          <w:bCs/>
+          <w:color w:val="1A9E9E"/>
+          <w:sz w:val="20"/>
+          <w:szCs w:val="20"/>
+        </w:rPr>
+        <w:t xml:space="preserve">•	</w:t>
+      </w:r>
+      <w:r>
+        <w:rPr>
+          <w:rFonts w:ascii="Calibri" w:cs="Calibri" w:eastAsia="Calibri" w:hAnsi="Calibri"/>
+          <w:sz w:val="20"/>
+          <w:szCs w:val="20"/>
+        </w:rPr>
+        <w:t xml:space="preserve">Les nouveaux messages arrivent d'eux-mêmes en quelques secondes. Ils ne vous gardent pas connecté : sans geste de votre part, la déconnexion après inactivité s'applique.</w:t>
+      </w:r>
+    </w:p>
+    <w:p>
+      <w:pPr>
+        <w:tabs>
+          <w:tab w:val="left" w:pos="360"/>
+        </w:tabs>
+        <w:spacing w:after="60"/>
+        <w:ind w:left="360" w:hanging="360"/>
+        <w:jc w:val="both"/>
+      </w:pPr>
+      <w:r>
+        <w:rPr>
+          <w:rFonts w:ascii="Calibri" w:cs="Calibri" w:eastAsia="Calibri" w:hAnsi="Calibri"/>
+          <w:b/>
+          <w:bCs/>
+          <w:color w:val="1A9E9E"/>
+          <w:sz w:val="20"/>
+          <w:szCs w:val="20"/>
+        </w:rPr>
+        <w:t xml:space="preserve">•	</w:t>
+      </w:r>
+      <w:r>
+        <w:rPr>
+          <w:rFonts w:ascii="Calibri" w:cs="Calibri" w:eastAsia="Calibri" w:hAnsi="Calibri"/>
+          <w:sz w:val="20"/>
+          <w:szCs w:val="20"/>
+        </w:rPr>
+        <w:t xml:space="preserve">Confidentialité : une conversation n'est lue que par ses membres, l'administration comprise.</w:t>
       </w:r>
     </w:p>
     <w:p>

</xml_diff>